<commit_message>
Guião de demonstração: começar pela dor de cada setor
Co-Authored-By: Claude Opus 5.5 <noreply@anthropic.com>
Claude-Session: https://claude.ai/code/session_01Vuo8nn8g7uDFargv9U1qmC
</commit_message>
<xml_diff>
--- a/vendas/Guiao-Demonstracao-Facitrack.docx
+++ b/vendas/Guiao-Demonstracao-Facitrack.docx
@@ -54,6 +54,8 @@
     <w:p>
       <w:pPr>
         <w:pStyle w:val="Heading2"/>
+        <w:keepNext/>
+        <w:keepLines/>
         <w:pBdr>
           <w:bottom w:val="single" w:color="E3C2C5" w:sz="4" w:space="2"/>
         </w:pBdr>
@@ -74,6 +76,7 @@
     <w:p>
       <w:pPr>
         <w:pStyle w:val="ListParagraph"/>
+        <w:keepNext w:val="false"/>
         <w:numPr>
           <w:ilvl w:val="0"/>
           <w:numId w:val="2"/>
@@ -102,6 +105,7 @@
     <w:p>
       <w:pPr>
         <w:pStyle w:val="ListParagraph"/>
+        <w:keepNext w:val="false"/>
         <w:numPr>
           <w:ilvl w:val="0"/>
           <w:numId w:val="2"/>
@@ -130,6 +134,7 @@
     <w:p>
       <w:pPr>
         <w:pStyle w:val="ListParagraph"/>
+        <w:keepNext w:val="false"/>
         <w:numPr>
           <w:ilvl w:val="0"/>
           <w:numId w:val="2"/>
@@ -158,6 +163,7 @@
     <w:p>
       <w:pPr>
         <w:pStyle w:val="ListParagraph"/>
+        <w:keepNext w:val="false"/>
         <w:numPr>
           <w:ilvl w:val="0"/>
           <w:numId w:val="2"/>
@@ -185,7 +191,38 @@
     </w:p>
     <w:p>
       <w:pPr>
+        <w:pStyle w:val="ListParagraph"/>
+        <w:keepNext w:val="false"/>
+        <w:numPr>
+          <w:ilvl w:val="0"/>
+          <w:numId w:val="2"/>
+        </w:numPr>
+        <w:spacing w:after="50" w:line="252"/>
+      </w:pPr>
+      <w:r>
+        <w:rPr>
+          <w:rFonts w:ascii="Calibri" w:cs="Calibri" w:eastAsia="Calibri" w:hAnsi="Calibri"/>
+          <w:b/>
+          <w:bCs/>
+          <w:sz w:val="21"/>
+          <w:szCs w:val="21"/>
+        </w:rPr>
+        <w:t xml:space="preserve">Começar pela dor do setor: </w:t>
+      </w:r>
+      <w:r>
+        <w:rPr>
+          <w:rFonts w:ascii="Calibri" w:cs="Calibri" w:eastAsia="Calibri" w:hAnsi="Calibri"/>
+          <w:sz w:val="21"/>
+          <w:szCs w:val="21"/>
+        </w:rPr>
+        <w:t xml:space="preserve">mostra-se sempre a plataforma completa, mas os passos 2 a 6 começam pelo módulo que resolve a dor do cliente (tabela abaixo). Os outros vêm a seguir, como “e isto também fica resolvido”.</w:t>
+      </w:r>
+    </w:p>
+    <w:p>
+      <w:pPr>
         <w:pStyle w:val="Heading2"/>
+        <w:keepNext/>
+        <w:keepLines/>
         <w:pBdr>
           <w:bottom w:val="single" w:color="E3C2C5" w:sz="4" w:space="2"/>
         </w:pBdr>
@@ -200,129 +237,709 @@
           <w:sz w:val="25"/>
           <w:szCs w:val="25"/>
         </w:rPr>
-        <w:t xml:space="preserve">1. Abertura e perguntas  ·  3 min</w:t>
-      </w:r>
-    </w:p>
-    <w:p>
-      <w:pPr>
-        <w:pStyle w:val="ListParagraph"/>
-        <w:numPr>
-          <w:ilvl w:val="0"/>
-          <w:numId w:val="2"/>
-        </w:numPr>
-        <w:spacing w:after="50" w:line="252"/>
-      </w:pPr>
-      <w:r>
-        <w:rPr>
-          <w:rFonts w:ascii="Calibri" w:cs="Calibri" w:eastAsia="Calibri" w:hAnsi="Calibri"/>
-          <w:sz w:val="21"/>
-          <w:szCs w:val="21"/>
-        </w:rPr>
-        <w:t xml:space="preserve">Quantas instalações têm e em quantas províncias?</w:t>
-      </w:r>
-    </w:p>
-    <w:p>
-      <w:pPr>
-        <w:pStyle w:val="ListParagraph"/>
-        <w:numPr>
-          <w:ilvl w:val="0"/>
-          <w:numId w:val="2"/>
-        </w:numPr>
-        <w:spacing w:after="50" w:line="252"/>
-      </w:pPr>
-      <w:r>
-        <w:rPr>
-          <w:rFonts w:ascii="Calibri" w:cs="Calibri" w:eastAsia="Calibri" w:hAnsi="Calibri"/>
-          <w:sz w:val="21"/>
-          <w:szCs w:val="21"/>
-        </w:rPr>
-        <w:t xml:space="preserve">Como registam hoje manutenções, limpezas e combustível? (Excel, papel, e-mail?)</w:t>
-      </w:r>
-    </w:p>
-    <w:p>
-      <w:pPr>
-        <w:pStyle w:val="ListParagraph"/>
-        <w:numPr>
-          <w:ilvl w:val="0"/>
-          <w:numId w:val="2"/>
-        </w:numPr>
-        <w:spacing w:after="50" w:line="252"/>
-      </w:pPr>
-      <w:r>
-        <w:rPr>
-          <w:rFonts w:ascii="Calibri" w:cs="Calibri" w:eastAsia="Calibri" w:hAnsi="Calibri"/>
-          <w:sz w:val="21"/>
-          <w:szCs w:val="21"/>
-        </w:rPr>
-        <w:t xml:space="preserve">Quem prepara os relatórios e quanto tempo leva por mês?</w:t>
-      </w:r>
-    </w:p>
-    <w:p>
-      <w:pPr>
-        <w:pStyle w:val="ListParagraph"/>
-        <w:numPr>
-          <w:ilvl w:val="0"/>
-          <w:numId w:val="2"/>
-        </w:numPr>
-        <w:spacing w:after="50" w:line="252"/>
-      </w:pPr>
-      <w:r>
-        <w:rPr>
-          <w:rFonts w:ascii="Calibri" w:cs="Calibri" w:eastAsia="Calibri" w:hAnsi="Calibri"/>
-          <w:sz w:val="21"/>
-          <w:szCs w:val="21"/>
-        </w:rPr>
-        <w:t xml:space="preserve">Têm geradores? Já tiveram combustível a desaparecer ou a acabar?</w:t>
-      </w:r>
-    </w:p>
-    <w:p>
-      <w:pPr>
-        <w:pStyle w:val="ListParagraph"/>
-        <w:numPr>
-          <w:ilvl w:val="0"/>
-          <w:numId w:val="2"/>
-        </w:numPr>
-        <w:spacing w:after="50" w:line="252"/>
-      </w:pPr>
-      <w:r>
-        <w:rPr>
-          <w:rFonts w:ascii="Calibri" w:cs="Calibri" w:eastAsia="Calibri" w:hAnsi="Calibri"/>
-          <w:sz w:val="21"/>
-          <w:szCs w:val="21"/>
-        </w:rPr>
-        <w:t xml:space="preserve">Como controlam o fim dos contratos e o orçamento por centro de custo?</w:t>
-      </w:r>
-    </w:p>
-    <w:p>
-      <w:pPr>
-        <w:spacing w:after="90" w:line="264"/>
-        <w:ind w:left="280"/>
-      </w:pPr>
-      <w:r>
-        <w:rPr>
-          <w:rFonts w:ascii="Calibri" w:cs="Calibri" w:eastAsia="Calibri" w:hAnsi="Calibri"/>
-          <w:b/>
-          <w:bCs/>
-          <w:color w:val="A0101E"/>
-          <w:sz w:val="21"/>
-          <w:szCs w:val="21"/>
-        </w:rPr>
-        <w:t xml:space="preserve">Dizer: </w:t>
-      </w:r>
-      <w:r>
-        <w:rPr>
-          <w:rFonts w:ascii="Calibri" w:cs="Calibri" w:eastAsia="Calibri" w:hAnsi="Calibri"/>
-          <w:i/>
-          <w:iCs/>
-          <w:sz w:val="21"/>
-          <w:szCs w:val="21"/>
-        </w:rPr>
-        <w:t xml:space="preserve">“Vou mostrar-vos em 15 minutos como isto fica num só sítio. Se fizer sentido, propomos um piloto de 60 dias com algumas das vossas instalações.”</w:t>
-      </w:r>
-    </w:p>
+        <w:t xml:space="preserve">Por onde começar, por setor</w:t>
+      </w:r>
+    </w:p>
+    <w:tbl>
+      <w:tblPr>
+        <w:tblW w:type="dxa" w:w="9866"/>
+        <w:tblBorders>
+          <w:top w:val="single" w:color="auto" w:sz="4"/>
+          <w:left w:val="single" w:color="auto" w:sz="4"/>
+          <w:bottom w:val="single" w:color="auto" w:sz="4"/>
+          <w:right w:val="single" w:color="auto" w:sz="4"/>
+          <w:insideH w:val="single" w:color="auto" w:sz="4"/>
+          <w:insideV w:val="single" w:color="auto" w:sz="4"/>
+        </w:tblBorders>
+      </w:tblPr>
+      <w:tblGrid>
+        <w:gridCol w:w="2300"/>
+        <w:gridCol w:w="3800"/>
+        <w:gridCol w:w="3766"/>
+      </w:tblGrid>
+      <w:tr>
+        <w:trPr>
+          <w:tblHeader/>
+        </w:trPr>
+        <w:tc>
+          <w:tcPr>
+            <w:tcW w:type="dxa" w:w="2300"/>
+            <w:tcBorders>
+              <w:top w:val="single" w:color="D9D9D9" w:sz="4"/>
+              <w:left w:val="single" w:color="D9D9D9" w:sz="4"/>
+              <w:bottom w:val="single" w:color="D9D9D9" w:sz="4"/>
+              <w:right w:val="single" w:color="D9D9D9" w:sz="4"/>
+            </w:tcBorders>
+            <w:shd w:fill="A0101E" w:color="auto" w:val="clear"/>
+            <w:tcMar>
+              <w:top w:type="dxa" w:w="60"/>
+              <w:left w:type="dxa" w:w="100"/>
+              <w:bottom w:type="dxa" w:w="60"/>
+              <w:right w:type="dxa" w:w="100"/>
+            </w:tcMar>
+          </w:tcPr>
+          <w:p>
+            <w:pPr>
+              <w:spacing w:after="0" w:line="240"/>
+            </w:pPr>
+            <w:r>
+              <w:rPr>
+                <w:rFonts w:ascii="Calibri" w:cs="Calibri" w:eastAsia="Calibri" w:hAnsi="Calibri"/>
+                <w:b/>
+                <w:bCs/>
+                <w:color w:val="FFFFFF"/>
+                <w:sz w:val="19"/>
+                <w:szCs w:val="19"/>
+              </w:rPr>
+              <w:t xml:space="preserve">Setor</w:t>
+            </w:r>
+          </w:p>
+        </w:tc>
+        <w:tc>
+          <w:tcPr>
+            <w:tcW w:type="dxa" w:w="3800"/>
+            <w:tcBorders>
+              <w:top w:val="single" w:color="D9D9D9" w:sz="4"/>
+              <w:left w:val="single" w:color="D9D9D9" w:sz="4"/>
+              <w:bottom w:val="single" w:color="D9D9D9" w:sz="4"/>
+              <w:right w:val="single" w:color="D9D9D9" w:sz="4"/>
+            </w:tcBorders>
+            <w:shd w:fill="A0101E" w:color="auto" w:val="clear"/>
+            <w:tcMar>
+              <w:top w:type="dxa" w:w="60"/>
+              <w:left w:type="dxa" w:w="100"/>
+              <w:bottom w:type="dxa" w:w="60"/>
+              <w:right w:type="dxa" w:w="100"/>
+            </w:tcMar>
+          </w:tcPr>
+          <w:p>
+            <w:pPr>
+              <w:spacing w:after="0" w:line="240"/>
+            </w:pPr>
+            <w:r>
+              <w:rPr>
+                <w:rFonts w:ascii="Calibri" w:cs="Calibri" w:eastAsia="Calibri" w:hAnsi="Calibri"/>
+                <w:b/>
+                <w:bCs/>
+                <w:color w:val="FFFFFF"/>
+                <w:sz w:val="19"/>
+                <w:szCs w:val="19"/>
+              </w:rPr>
+              <w:t xml:space="preserve">Dor de entrada</w:t>
+            </w:r>
+          </w:p>
+        </w:tc>
+        <w:tc>
+          <w:tcPr>
+            <w:tcW w:type="dxa" w:w="3766"/>
+            <w:tcBorders>
+              <w:top w:val="single" w:color="D9D9D9" w:sz="4"/>
+              <w:left w:val="single" w:color="D9D9D9" w:sz="4"/>
+              <w:bottom w:val="single" w:color="D9D9D9" w:sz="4"/>
+              <w:right w:val="single" w:color="D9D9D9" w:sz="4"/>
+            </w:tcBorders>
+            <w:shd w:fill="A0101E" w:color="auto" w:val="clear"/>
+            <w:tcMar>
+              <w:top w:type="dxa" w:w="60"/>
+              <w:left w:type="dxa" w:w="100"/>
+              <w:bottom w:type="dxa" w:w="60"/>
+              <w:right w:type="dxa" w:w="100"/>
+            </w:tcMar>
+          </w:tcPr>
+          <w:p>
+            <w:pPr>
+              <w:spacing w:after="0" w:line="240"/>
+            </w:pPr>
+            <w:r>
+              <w:rPr>
+                <w:rFonts w:ascii="Calibri" w:cs="Calibri" w:eastAsia="Calibri" w:hAnsi="Calibri"/>
+                <w:b/>
+                <w:bCs/>
+                <w:color w:val="FFFFFF"/>
+                <w:sz w:val="19"/>
+                <w:szCs w:val="19"/>
+              </w:rPr>
+              <w:t xml:space="preserve">Mostrar primeiro</w:t>
+            </w:r>
+          </w:p>
+        </w:tc>
+      </w:tr>
+      <w:tr>
+        <w:trPr>
+          <w:tblHeader w:val="off"/>
+        </w:trPr>
+        <w:tc>
+          <w:tcPr>
+            <w:tcW w:type="dxa" w:w="2300"/>
+            <w:tcBorders>
+              <w:top w:val="single" w:color="D9D9D9" w:sz="4"/>
+              <w:left w:val="single" w:color="D9D9D9" w:sz="4"/>
+              <w:bottom w:val="single" w:color="D9D9D9" w:sz="4"/>
+              <w:right w:val="single" w:color="D9D9D9" w:sz="4"/>
+            </w:tcBorders>
+            <w:tcMar>
+              <w:top w:type="dxa" w:w="60"/>
+              <w:left w:type="dxa" w:w="100"/>
+              <w:bottom w:type="dxa" w:w="60"/>
+              <w:right w:type="dxa" w:w="100"/>
+            </w:tcMar>
+          </w:tcPr>
+          <w:p>
+            <w:pPr>
+              <w:spacing w:after="0" w:line="240"/>
+            </w:pPr>
+            <w:r>
+              <w:rPr>
+                <w:rFonts w:ascii="Calibri" w:cs="Calibri" w:eastAsia="Calibri" w:hAnsi="Calibri"/>
+                <w:sz w:val="19"/>
+                <w:szCs w:val="19"/>
+              </w:rPr>
+              <w:t xml:space="preserve">Supermercados e retalho</w:t>
+            </w:r>
+          </w:p>
+        </w:tc>
+        <w:tc>
+          <w:tcPr>
+            <w:tcW w:type="dxa" w:w="3800"/>
+            <w:tcBorders>
+              <w:top w:val="single" w:color="D9D9D9" w:sz="4"/>
+              <w:left w:val="single" w:color="D9D9D9" w:sz="4"/>
+              <w:bottom w:val="single" w:color="D9D9D9" w:sz="4"/>
+              <w:right w:val="single" w:color="D9D9D9" w:sz="4"/>
+            </w:tcBorders>
+            <w:tcMar>
+              <w:top w:type="dxa" w:w="60"/>
+              <w:left w:type="dxa" w:w="100"/>
+              <w:bottom w:type="dxa" w:w="60"/>
+              <w:right w:type="dxa" w:w="100"/>
+            </w:tcMar>
+          </w:tcPr>
+          <w:p>
+            <w:pPr>
+              <w:spacing w:after="0" w:line="240"/>
+            </w:pPr>
+            <w:r>
+              <w:rPr>
+                <w:rFonts w:ascii="Calibri" w:cs="Calibri" w:eastAsia="Calibri" w:hAnsi="Calibri"/>
+                <w:sz w:val="19"/>
+                <w:szCs w:val="19"/>
+              </w:rPr>
+              <w:t xml:space="preserve">Avarias de frio e equipamentos; limpezas loja a loja</w:t>
+            </w:r>
+          </w:p>
+        </w:tc>
+        <w:tc>
+          <w:tcPr>
+            <w:tcW w:type="dxa" w:w="3766"/>
+            <w:tcBorders>
+              <w:top w:val="single" w:color="D9D9D9" w:sz="4"/>
+              <w:left w:val="single" w:color="D9D9D9" w:sz="4"/>
+              <w:bottom w:val="single" w:color="D9D9D9" w:sz="4"/>
+              <w:right w:val="single" w:color="D9D9D9" w:sz="4"/>
+            </w:tcBorders>
+            <w:tcMar>
+              <w:top w:type="dxa" w:w="60"/>
+              <w:left w:type="dxa" w:w="100"/>
+              <w:bottom w:type="dxa" w:w="60"/>
+              <w:right w:type="dxa" w:w="100"/>
+            </w:tcMar>
+          </w:tcPr>
+          <w:p>
+            <w:pPr>
+              <w:spacing w:after="0" w:line="240"/>
+            </w:pPr>
+            <w:r>
+              <w:rPr>
+                <w:rFonts w:ascii="Calibri" w:cs="Calibri" w:eastAsia="Calibri" w:hAnsi="Calibri"/>
+                <w:sz w:val="19"/>
+                <w:szCs w:val="19"/>
+              </w:rPr>
+              <w:t xml:space="preserve">Manutenções, equipamentos, limpezas, relatório de fornecedores</w:t>
+            </w:r>
+          </w:p>
+        </w:tc>
+      </w:tr>
+      <w:tr>
+        <w:trPr>
+          <w:tblHeader w:val="off"/>
+        </w:trPr>
+        <w:tc>
+          <w:tcPr>
+            <w:tcW w:type="dxa" w:w="2300"/>
+            <w:tcBorders>
+              <w:top w:val="single" w:color="D9D9D9" w:sz="4"/>
+              <w:left w:val="single" w:color="D9D9D9" w:sz="4"/>
+              <w:bottom w:val="single" w:color="D9D9D9" w:sz="4"/>
+              <w:right w:val="single" w:color="D9D9D9" w:sz="4"/>
+            </w:tcBorders>
+            <w:tcMar>
+              <w:top w:type="dxa" w:w="60"/>
+              <w:left w:type="dxa" w:w="100"/>
+              <w:bottom w:type="dxa" w:w="60"/>
+              <w:right w:type="dxa" w:w="100"/>
+            </w:tcMar>
+          </w:tcPr>
+          <w:p>
+            <w:pPr>
+              <w:spacing w:after="0" w:line="240"/>
+            </w:pPr>
+            <w:r>
+              <w:rPr>
+                <w:rFonts w:ascii="Calibri" w:cs="Calibri" w:eastAsia="Calibri" w:hAnsi="Calibri"/>
+                <w:sz w:val="19"/>
+                <w:szCs w:val="19"/>
+              </w:rPr>
+              <w:t xml:space="preserve">Telecomunicações</w:t>
+            </w:r>
+          </w:p>
+        </w:tc>
+        <w:tc>
+          <w:tcPr>
+            <w:tcW w:type="dxa" w:w="3800"/>
+            <w:tcBorders>
+              <w:top w:val="single" w:color="D9D9D9" w:sz="4"/>
+              <w:left w:val="single" w:color="D9D9D9" w:sz="4"/>
+              <w:bottom w:val="single" w:color="D9D9D9" w:sz="4"/>
+              <w:right w:val="single" w:color="D9D9D9" w:sz="4"/>
+            </w:tcBorders>
+            <w:tcMar>
+              <w:top w:type="dxa" w:w="60"/>
+              <w:left w:type="dxa" w:w="100"/>
+              <w:bottom w:type="dxa" w:w="60"/>
+              <w:right w:type="dxa" w:w="100"/>
+            </w:tcMar>
+          </w:tcPr>
+          <w:p>
+            <w:pPr>
+              <w:spacing w:after="0" w:line="240"/>
+            </w:pPr>
+            <w:r>
+              <w:rPr>
+                <w:rFonts w:ascii="Calibri" w:cs="Calibri" w:eastAsia="Calibri" w:hAnsi="Calibri"/>
+                <w:sz w:val="19"/>
+                <w:szCs w:val="19"/>
+              </w:rPr>
+              <w:t xml:space="preserve">Geradores e combustível em muitos locais</w:t>
+            </w:r>
+          </w:p>
+        </w:tc>
+        <w:tc>
+          <w:tcPr>
+            <w:tcW w:type="dxa" w:w="3766"/>
+            <w:tcBorders>
+              <w:top w:val="single" w:color="D9D9D9" w:sz="4"/>
+              <w:left w:val="single" w:color="D9D9D9" w:sz="4"/>
+              <w:bottom w:val="single" w:color="D9D9D9" w:sz="4"/>
+              <w:right w:val="single" w:color="D9D9D9" w:sz="4"/>
+            </w:tcBorders>
+            <w:tcMar>
+              <w:top w:type="dxa" w:w="60"/>
+              <w:left w:type="dxa" w:w="100"/>
+              <w:bottom w:type="dxa" w:w="60"/>
+              <w:right w:type="dxa" w:w="100"/>
+            </w:tcMar>
+          </w:tcPr>
+          <w:p>
+            <w:pPr>
+              <w:spacing w:after="0" w:line="240"/>
+            </w:pPr>
+            <w:r>
+              <w:rPr>
+                <w:rFonts w:ascii="Calibri" w:cs="Calibri" w:eastAsia="Calibri" w:hAnsi="Calibri"/>
+                <w:sz w:val="19"/>
+                <w:szCs w:val="19"/>
+              </w:rPr>
+              <w:t xml:space="preserve">Leituras do gerador, alertas de combustível, manutenções</w:t>
+            </w:r>
+          </w:p>
+        </w:tc>
+      </w:tr>
+      <w:tr>
+        <w:trPr>
+          <w:tblHeader w:val="off"/>
+        </w:trPr>
+        <w:tc>
+          <w:tcPr>
+            <w:tcW w:type="dxa" w:w="2300"/>
+            <w:tcBorders>
+              <w:top w:val="single" w:color="D9D9D9" w:sz="4"/>
+              <w:left w:val="single" w:color="D9D9D9" w:sz="4"/>
+              <w:bottom w:val="single" w:color="D9D9D9" w:sz="4"/>
+              <w:right w:val="single" w:color="D9D9D9" w:sz="4"/>
+            </w:tcBorders>
+            <w:tcMar>
+              <w:top w:type="dxa" w:w="60"/>
+              <w:left w:type="dxa" w:w="100"/>
+              <w:bottom w:type="dxa" w:w="60"/>
+              <w:right w:type="dxa" w:w="100"/>
+            </w:tcMar>
+          </w:tcPr>
+          <w:p>
+            <w:pPr>
+              <w:spacing w:after="0" w:line="240"/>
+            </w:pPr>
+            <w:r>
+              <w:rPr>
+                <w:rFonts w:ascii="Calibri" w:cs="Calibri" w:eastAsia="Calibri" w:hAnsi="Calibri"/>
+                <w:sz w:val="19"/>
+                <w:szCs w:val="19"/>
+              </w:rPr>
+              <w:t xml:space="preserve">Hotéis e turismo</w:t>
+            </w:r>
+          </w:p>
+        </w:tc>
+        <w:tc>
+          <w:tcPr>
+            <w:tcW w:type="dxa" w:w="3800"/>
+            <w:tcBorders>
+              <w:top w:val="single" w:color="D9D9D9" w:sz="4"/>
+              <w:left w:val="single" w:color="D9D9D9" w:sz="4"/>
+              <w:bottom w:val="single" w:color="D9D9D9" w:sz="4"/>
+              <w:right w:val="single" w:color="D9D9D9" w:sz="4"/>
+            </w:tcBorders>
+            <w:tcMar>
+              <w:top w:type="dxa" w:w="60"/>
+              <w:left w:type="dxa" w:w="100"/>
+              <w:bottom w:type="dxa" w:w="60"/>
+              <w:right w:type="dxa" w:w="100"/>
+            </w:tcMar>
+          </w:tcPr>
+          <w:p>
+            <w:pPr>
+              <w:spacing w:after="0" w:line="240"/>
+            </w:pPr>
+            <w:r>
+              <w:rPr>
+                <w:rFonts w:ascii="Calibri" w:cs="Calibri" w:eastAsia="Calibri" w:hAnsi="Calibri"/>
+                <w:sz w:val="19"/>
+                <w:szCs w:val="19"/>
+              </w:rPr>
+              <w:t xml:space="preserve">Manutenção de quartos e áreas comuns; incidentes</w:t>
+            </w:r>
+          </w:p>
+        </w:tc>
+        <w:tc>
+          <w:tcPr>
+            <w:tcW w:type="dxa" w:w="3766"/>
+            <w:tcBorders>
+              <w:top w:val="single" w:color="D9D9D9" w:sz="4"/>
+              <w:left w:val="single" w:color="D9D9D9" w:sz="4"/>
+              <w:bottom w:val="single" w:color="D9D9D9" w:sz="4"/>
+              <w:right w:val="single" w:color="D9D9D9" w:sz="4"/>
+            </w:tcBorders>
+            <w:tcMar>
+              <w:top w:type="dxa" w:w="60"/>
+              <w:left w:type="dxa" w:w="100"/>
+              <w:bottom w:type="dxa" w:w="60"/>
+              <w:right w:type="dxa" w:w="100"/>
+            </w:tcMar>
+          </w:tcPr>
+          <w:p>
+            <w:pPr>
+              <w:spacing w:after="0" w:line="240"/>
+            </w:pPr>
+            <w:r>
+              <w:rPr>
+                <w:rFonts w:ascii="Calibri" w:cs="Calibri" w:eastAsia="Calibri" w:hAnsi="Calibri"/>
+                <w:sz w:val="19"/>
+                <w:szCs w:val="19"/>
+              </w:rPr>
+              <w:t xml:space="preserve">Manutenções, incidentes, contratos com fornecedores</w:t>
+            </w:r>
+          </w:p>
+        </w:tc>
+      </w:tr>
+      <w:tr>
+        <w:trPr>
+          <w:tblHeader w:val="off"/>
+        </w:trPr>
+        <w:tc>
+          <w:tcPr>
+            <w:tcW w:type="dxa" w:w="2300"/>
+            <w:tcBorders>
+              <w:top w:val="single" w:color="D9D9D9" w:sz="4"/>
+              <w:left w:val="single" w:color="D9D9D9" w:sz="4"/>
+              <w:bottom w:val="single" w:color="D9D9D9" w:sz="4"/>
+              <w:right w:val="single" w:color="D9D9D9" w:sz="4"/>
+            </w:tcBorders>
+            <w:tcMar>
+              <w:top w:type="dxa" w:w="60"/>
+              <w:left w:type="dxa" w:w="100"/>
+              <w:bottom w:type="dxa" w:w="60"/>
+              <w:right w:type="dxa" w:w="100"/>
+            </w:tcMar>
+          </w:tcPr>
+          <w:p>
+            <w:pPr>
+              <w:spacing w:after="0" w:line="240"/>
+            </w:pPr>
+            <w:r>
+              <w:rPr>
+                <w:rFonts w:ascii="Calibri" w:cs="Calibri" w:eastAsia="Calibri" w:hAnsi="Calibri"/>
+                <w:sz w:val="19"/>
+                <w:szCs w:val="19"/>
+              </w:rPr>
+              <w:t xml:space="preserve">Clínicas e hospitais</w:t>
+            </w:r>
+          </w:p>
+        </w:tc>
+        <w:tc>
+          <w:tcPr>
+            <w:tcW w:type="dxa" w:w="3800"/>
+            <w:tcBorders>
+              <w:top w:val="single" w:color="D9D9D9" w:sz="4"/>
+              <w:left w:val="single" w:color="D9D9D9" w:sz="4"/>
+              <w:bottom w:val="single" w:color="D9D9D9" w:sz="4"/>
+              <w:right w:val="single" w:color="D9D9D9" w:sz="4"/>
+            </w:tcBorders>
+            <w:tcMar>
+              <w:top w:type="dxa" w:w="60"/>
+              <w:left w:type="dxa" w:w="100"/>
+              <w:bottom w:type="dxa" w:w="60"/>
+              <w:right w:type="dxa" w:w="100"/>
+            </w:tcMar>
+          </w:tcPr>
+          <w:p>
+            <w:pPr>
+              <w:spacing w:after="0" w:line="240"/>
+            </w:pPr>
+            <w:r>
+              <w:rPr>
+                <w:rFonts w:ascii="Calibri" w:cs="Calibri" w:eastAsia="Calibri" w:hAnsi="Calibri"/>
+                <w:sz w:val="19"/>
+                <w:szCs w:val="19"/>
+              </w:rPr>
+              <w:t xml:space="preserve">Higiene e fumigações para inspeções; equipamentos</w:t>
+            </w:r>
+          </w:p>
+        </w:tc>
+        <w:tc>
+          <w:tcPr>
+            <w:tcW w:type="dxa" w:w="3766"/>
+            <w:tcBorders>
+              <w:top w:val="single" w:color="D9D9D9" w:sz="4"/>
+              <w:left w:val="single" w:color="D9D9D9" w:sz="4"/>
+              <w:bottom w:val="single" w:color="D9D9D9" w:sz="4"/>
+              <w:right w:val="single" w:color="D9D9D9" w:sz="4"/>
+            </w:tcBorders>
+            <w:tcMar>
+              <w:top w:type="dxa" w:w="60"/>
+              <w:left w:type="dxa" w:w="100"/>
+              <w:bottom w:type="dxa" w:w="60"/>
+              <w:right w:type="dxa" w:w="100"/>
+            </w:tcMar>
+          </w:tcPr>
+          <w:p>
+            <w:pPr>
+              <w:spacing w:after="0" w:line="240"/>
+            </w:pPr>
+            <w:r>
+              <w:rPr>
+                <w:rFonts w:ascii="Calibri" w:cs="Calibri" w:eastAsia="Calibri" w:hAnsi="Calibri"/>
+                <w:sz w:val="19"/>
+                <w:szCs w:val="19"/>
+              </w:rPr>
+              <w:t xml:space="preserve">Limpezas, fumigações, manutenções</w:t>
+            </w:r>
+          </w:p>
+        </w:tc>
+      </w:tr>
+      <w:tr>
+        <w:trPr>
+          <w:tblHeader w:val="off"/>
+        </w:trPr>
+        <w:tc>
+          <w:tcPr>
+            <w:tcW w:type="dxa" w:w="2300"/>
+            <w:tcBorders>
+              <w:top w:val="single" w:color="D9D9D9" w:sz="4"/>
+              <w:left w:val="single" w:color="D9D9D9" w:sz="4"/>
+              <w:bottom w:val="single" w:color="D9D9D9" w:sz="4"/>
+              <w:right w:val="single" w:color="D9D9D9" w:sz="4"/>
+            </w:tcBorders>
+            <w:tcMar>
+              <w:top w:type="dxa" w:w="60"/>
+              <w:left w:type="dxa" w:w="100"/>
+              <w:bottom w:type="dxa" w:w="60"/>
+              <w:right w:type="dxa" w:w="100"/>
+            </w:tcMar>
+          </w:tcPr>
+          <w:p>
+            <w:pPr>
+              <w:spacing w:after="0" w:line="240"/>
+            </w:pPr>
+            <w:r>
+              <w:rPr>
+                <w:rFonts w:ascii="Calibri" w:cs="Calibri" w:eastAsia="Calibri" w:hAnsi="Calibri"/>
+                <w:sz w:val="19"/>
+                <w:szCs w:val="19"/>
+              </w:rPr>
+              <w:t xml:space="preserve">Escolas e universidades</w:t>
+            </w:r>
+          </w:p>
+        </w:tc>
+        <w:tc>
+          <w:tcPr>
+            <w:tcW w:type="dxa" w:w="3800"/>
+            <w:tcBorders>
+              <w:top w:val="single" w:color="D9D9D9" w:sz="4"/>
+              <w:left w:val="single" w:color="D9D9D9" w:sz="4"/>
+              <w:bottom w:val="single" w:color="D9D9D9" w:sz="4"/>
+              <w:right w:val="single" w:color="D9D9D9" w:sz="4"/>
+            </w:tcBorders>
+            <w:tcMar>
+              <w:top w:type="dxa" w:w="60"/>
+              <w:left w:type="dxa" w:w="100"/>
+              <w:bottom w:type="dxa" w:w="60"/>
+              <w:right w:type="dxa" w:w="100"/>
+            </w:tcMar>
+          </w:tcPr>
+          <w:p>
+            <w:pPr>
+              <w:spacing w:after="0" w:line="240"/>
+            </w:pPr>
+            <w:r>
+              <w:rPr>
+                <w:rFonts w:ascii="Calibri" w:cs="Calibri" w:eastAsia="Calibri" w:hAnsi="Calibri"/>
+                <w:sz w:val="19"/>
+                <w:szCs w:val="19"/>
+              </w:rPr>
+              <w:t xml:space="preserve">Orçamento apertado; contratos de limpeza e segurança</w:t>
+            </w:r>
+          </w:p>
+        </w:tc>
+        <w:tc>
+          <w:tcPr>
+            <w:tcW w:type="dxa" w:w="3766"/>
+            <w:tcBorders>
+              <w:top w:val="single" w:color="D9D9D9" w:sz="4"/>
+              <w:left w:val="single" w:color="D9D9D9" w:sz="4"/>
+              <w:bottom w:val="single" w:color="D9D9D9" w:sz="4"/>
+              <w:right w:val="single" w:color="D9D9D9" w:sz="4"/>
+            </w:tcBorders>
+            <w:tcMar>
+              <w:top w:type="dxa" w:w="60"/>
+              <w:left w:type="dxa" w:w="100"/>
+              <w:bottom w:type="dxa" w:w="60"/>
+              <w:right w:type="dxa" w:w="100"/>
+            </w:tcMar>
+          </w:tcPr>
+          <w:p>
+            <w:pPr>
+              <w:spacing w:after="0" w:line="240"/>
+            </w:pPr>
+            <w:r>
+              <w:rPr>
+                <w:rFonts w:ascii="Calibri" w:cs="Calibri" w:eastAsia="Calibri" w:hAnsi="Calibri"/>
+                <w:sz w:val="19"/>
+                <w:szCs w:val="19"/>
+              </w:rPr>
+              <w:t xml:space="preserve">Contratos e orçamento por centro de custo</w:t>
+            </w:r>
+          </w:p>
+        </w:tc>
+      </w:tr>
+      <w:tr>
+        <w:trPr>
+          <w:tblHeader w:val="off"/>
+        </w:trPr>
+        <w:tc>
+          <w:tcPr>
+            <w:tcW w:type="dxa" w:w="2300"/>
+            <w:tcBorders>
+              <w:top w:val="single" w:color="D9D9D9" w:sz="4"/>
+              <w:left w:val="single" w:color="D9D9D9" w:sz="4"/>
+              <w:bottom w:val="single" w:color="D9D9D9" w:sz="4"/>
+              <w:right w:val="single" w:color="D9D9D9" w:sz="4"/>
+            </w:tcBorders>
+            <w:tcMar>
+              <w:top w:type="dxa" w:w="60"/>
+              <w:left w:type="dxa" w:w="100"/>
+              <w:bottom w:type="dxa" w:w="60"/>
+              <w:right w:type="dxa" w:w="100"/>
+            </w:tcMar>
+          </w:tcPr>
+          <w:p>
+            <w:pPr>
+              <w:spacing w:after="0" w:line="240"/>
+            </w:pPr>
+            <w:r>
+              <w:rPr>
+                <w:rFonts w:ascii="Calibri" w:cs="Calibri" w:eastAsia="Calibri" w:hAnsi="Calibri"/>
+                <w:sz w:val="19"/>
+                <w:szCs w:val="19"/>
+              </w:rPr>
+              <w:t xml:space="preserve">Logística e transportes</w:t>
+            </w:r>
+          </w:p>
+        </w:tc>
+        <w:tc>
+          <w:tcPr>
+            <w:tcW w:type="dxa" w:w="3800"/>
+            <w:tcBorders>
+              <w:top w:val="single" w:color="D9D9D9" w:sz="4"/>
+              <w:left w:val="single" w:color="D9D9D9" w:sz="4"/>
+              <w:bottom w:val="single" w:color="D9D9D9" w:sz="4"/>
+              <w:right w:val="single" w:color="D9D9D9" w:sz="4"/>
+            </w:tcBorders>
+            <w:tcMar>
+              <w:top w:type="dxa" w:w="60"/>
+              <w:left w:type="dxa" w:w="100"/>
+              <w:bottom w:type="dxa" w:w="60"/>
+              <w:right w:type="dxa" w:w="100"/>
+            </w:tcMar>
+          </w:tcPr>
+          <w:p>
+            <w:pPr>
+              <w:spacing w:after="0" w:line="240"/>
+            </w:pPr>
+            <w:r>
+              <w:rPr>
+                <w:rFonts w:ascii="Calibri" w:cs="Calibri" w:eastAsia="Calibri" w:hAnsi="Calibri"/>
+                <w:sz w:val="19"/>
+                <w:szCs w:val="19"/>
+              </w:rPr>
+              <w:t xml:space="preserve">Armazéns, geradores e fumigações</w:t>
+            </w:r>
+          </w:p>
+        </w:tc>
+        <w:tc>
+          <w:tcPr>
+            <w:tcW w:type="dxa" w:w="3766"/>
+            <w:tcBorders>
+              <w:top w:val="single" w:color="D9D9D9" w:sz="4"/>
+              <w:left w:val="single" w:color="D9D9D9" w:sz="4"/>
+              <w:bottom w:val="single" w:color="D9D9D9" w:sz="4"/>
+              <w:right w:val="single" w:color="D9D9D9" w:sz="4"/>
+            </w:tcBorders>
+            <w:tcMar>
+              <w:top w:type="dxa" w:w="60"/>
+              <w:left w:type="dxa" w:w="100"/>
+              <w:bottom w:type="dxa" w:w="60"/>
+              <w:right w:type="dxa" w:w="100"/>
+            </w:tcMar>
+          </w:tcPr>
+          <w:p>
+            <w:pPr>
+              <w:spacing w:after="0" w:line="240"/>
+            </w:pPr>
+            <w:r>
+              <w:rPr>
+                <w:rFonts w:ascii="Calibri" w:cs="Calibri" w:eastAsia="Calibri" w:hAnsi="Calibri"/>
+                <w:sz w:val="19"/>
+                <w:szCs w:val="19"/>
+              </w:rPr>
+              <w:t xml:space="preserve">Gerador, fumigações, manutenções</w:t>
+            </w:r>
+          </w:p>
+        </w:tc>
+      </w:tr>
+    </w:tbl>
     <w:p>
       <w:pPr>
         <w:pStyle w:val="Heading2"/>
+        <w:keepNext/>
+        <w:keepLines/>
         <w:pBdr>
           <w:bottom w:val="single" w:color="E3C2C5" w:sz="4" w:space="2"/>
         </w:pBdr>
@@ -337,61 +954,102 @@
           <w:sz w:val="25"/>
           <w:szCs w:val="25"/>
         </w:rPr>
-        <w:t xml:space="preserve">2. Painel e alertas  ·  3 min</w:t>
-      </w:r>
-    </w:p>
-    <w:p>
-      <w:pPr>
-        <w:pStyle w:val="ListParagraph"/>
-        <w:numPr>
-          <w:ilvl w:val="0"/>
-          <w:numId w:val="2"/>
-        </w:numPr>
-        <w:spacing w:after="50" w:line="252"/>
-      </w:pPr>
-      <w:r>
-        <w:rPr>
-          <w:rFonts w:ascii="Calibri" w:cs="Calibri" w:eastAsia="Calibri" w:hAnsi="Calibri"/>
-          <w:sz w:val="21"/>
-          <w:szCs w:val="21"/>
-        </w:rPr>
-        <w:t xml:space="preserve">Abrir o Dashboard: um cartão por área, cada uma com os seus números.</w:t>
-      </w:r>
-    </w:p>
-    <w:p>
-      <w:pPr>
-        <w:pStyle w:val="ListParagraph"/>
-        <w:numPr>
-          <w:ilvl w:val="0"/>
-          <w:numId w:val="2"/>
-        </w:numPr>
-        <w:spacing w:after="50" w:line="252"/>
-      </w:pPr>
-      <w:r>
-        <w:rPr>
-          <w:rFonts w:ascii="Calibri" w:cs="Calibri" w:eastAsia="Calibri" w:hAnsi="Calibri"/>
-          <w:sz w:val="21"/>
-          <w:szCs w:val="21"/>
-        </w:rPr>
-        <w:t xml:space="preserve">Abrir Alertas: agendamentos em atraso, gerador e contratos a terminar.</w:t>
-      </w:r>
-    </w:p>
-    <w:p>
-      <w:pPr>
-        <w:pStyle w:val="ListParagraph"/>
-        <w:numPr>
-          <w:ilvl w:val="0"/>
-          <w:numId w:val="2"/>
-        </w:numPr>
-        <w:spacing w:after="50" w:line="252"/>
-      </w:pPr>
-      <w:r>
-        <w:rPr>
-          <w:rFonts w:ascii="Calibri" w:cs="Calibri" w:eastAsia="Calibri" w:hAnsi="Calibri"/>
-          <w:sz w:val="21"/>
-          <w:szCs w:val="21"/>
-        </w:rPr>
-        <w:t xml:space="preserve">Clicar num alerta e mostrar a ficha da instalação com tudo o que lá aconteceu.</w:t>
+        <w:t xml:space="preserve">1. Abertura e perguntas  ·  3 min</w:t>
+      </w:r>
+    </w:p>
+    <w:p>
+      <w:pPr>
+        <w:pStyle w:val="ListParagraph"/>
+        <w:keepNext/>
+        <w:numPr>
+          <w:ilvl w:val="0"/>
+          <w:numId w:val="2"/>
+        </w:numPr>
+        <w:spacing w:after="50" w:line="252"/>
+      </w:pPr>
+      <w:r>
+        <w:rPr>
+          <w:rFonts w:ascii="Calibri" w:cs="Calibri" w:eastAsia="Calibri" w:hAnsi="Calibri"/>
+          <w:sz w:val="21"/>
+          <w:szCs w:val="21"/>
+        </w:rPr>
+        <w:t xml:space="preserve">Quantas instalações têm e em quantas províncias?</w:t>
+      </w:r>
+    </w:p>
+    <w:p>
+      <w:pPr>
+        <w:pStyle w:val="ListParagraph"/>
+        <w:keepNext w:val="false"/>
+        <w:numPr>
+          <w:ilvl w:val="0"/>
+          <w:numId w:val="2"/>
+        </w:numPr>
+        <w:spacing w:after="50" w:line="252"/>
+      </w:pPr>
+      <w:r>
+        <w:rPr>
+          <w:rFonts w:ascii="Calibri" w:cs="Calibri" w:eastAsia="Calibri" w:hAnsi="Calibri"/>
+          <w:sz w:val="21"/>
+          <w:szCs w:val="21"/>
+        </w:rPr>
+        <w:t xml:space="preserve">Como registam hoje manutenções, limpezas e combustível? (Excel, papel, e-mail?)</w:t>
+      </w:r>
+    </w:p>
+    <w:p>
+      <w:pPr>
+        <w:pStyle w:val="ListParagraph"/>
+        <w:keepNext w:val="false"/>
+        <w:numPr>
+          <w:ilvl w:val="0"/>
+          <w:numId w:val="2"/>
+        </w:numPr>
+        <w:spacing w:after="50" w:line="252"/>
+      </w:pPr>
+      <w:r>
+        <w:rPr>
+          <w:rFonts w:ascii="Calibri" w:cs="Calibri" w:eastAsia="Calibri" w:hAnsi="Calibri"/>
+          <w:sz w:val="21"/>
+          <w:szCs w:val="21"/>
+        </w:rPr>
+        <w:t xml:space="preserve">Quem prepara os relatórios e quanto tempo leva por mês?</w:t>
+      </w:r>
+    </w:p>
+    <w:p>
+      <w:pPr>
+        <w:pStyle w:val="ListParagraph"/>
+        <w:keepNext w:val="false"/>
+        <w:numPr>
+          <w:ilvl w:val="0"/>
+          <w:numId w:val="2"/>
+        </w:numPr>
+        <w:spacing w:after="50" w:line="252"/>
+      </w:pPr>
+      <w:r>
+        <w:rPr>
+          <w:rFonts w:ascii="Calibri" w:cs="Calibri" w:eastAsia="Calibri" w:hAnsi="Calibri"/>
+          <w:sz w:val="21"/>
+          <w:szCs w:val="21"/>
+        </w:rPr>
+        <w:t xml:space="preserve">Têm geradores? Já tiveram combustível a desaparecer ou a acabar?</w:t>
+      </w:r>
+    </w:p>
+    <w:p>
+      <w:pPr>
+        <w:pStyle w:val="ListParagraph"/>
+        <w:keepNext w:val="false"/>
+        <w:numPr>
+          <w:ilvl w:val="0"/>
+          <w:numId w:val="2"/>
+        </w:numPr>
+        <w:spacing w:after="50" w:line="252"/>
+      </w:pPr>
+      <w:r>
+        <w:rPr>
+          <w:rFonts w:ascii="Calibri" w:cs="Calibri" w:eastAsia="Calibri" w:hAnsi="Calibri"/>
+          <w:sz w:val="21"/>
+          <w:szCs w:val="21"/>
+        </w:rPr>
+        <w:t xml:space="preserve">Como controlam o fim dos contratos e o orçamento por centro de custo?</w:t>
       </w:r>
     </w:p>
     <w:p>
@@ -418,12 +1076,14 @@
           <w:sz w:val="21"/>
           <w:szCs w:val="21"/>
         </w:rPr>
-        <w:t xml:space="preserve">“Isto é o que o vosso responsável vê de manhã: o que precisa de atenção hoje, sem abrir nenhum Excel.”</w:t>
+        <w:t xml:space="preserve">“Vou mostrar-vos em 15 minutos como isto fica num só sítio. Se fizer sentido, propomos um piloto de 60 dias com algumas das vossas instalações.”</w:t>
       </w:r>
     </w:p>
     <w:p>
       <w:pPr>
         <w:pStyle w:val="Heading2"/>
+        <w:keepNext/>
+        <w:keepLines/>
         <w:pBdr>
           <w:bottom w:val="single" w:color="E3C2C5" w:sz="4" w:space="2"/>
         </w:pBdr>
@@ -438,43 +1098,64 @@
           <w:sz w:val="25"/>
           <w:szCs w:val="25"/>
         </w:rPr>
-        <w:t xml:space="preserve">3. Ordem de trabalho lida por IA  ·  3 min</w:t>
-      </w:r>
-    </w:p>
-    <w:p>
-      <w:pPr>
-        <w:pStyle w:val="ListParagraph"/>
-        <w:numPr>
-          <w:ilvl w:val="0"/>
-          <w:numId w:val="2"/>
-        </w:numPr>
-        <w:spacing w:after="50" w:line="252"/>
-      </w:pPr>
-      <w:r>
-        <w:rPr>
-          <w:rFonts w:ascii="Calibri" w:cs="Calibri" w:eastAsia="Calibri" w:hAnsi="Calibri"/>
-          <w:sz w:val="21"/>
-          <w:szCs w:val="21"/>
-        </w:rPr>
-        <w:t xml:space="preserve">Em Nova manutenção, fotografar a ordem de trabalho em papel com o telemóvel.</w:t>
-      </w:r>
-    </w:p>
-    <w:p>
-      <w:pPr>
-        <w:pStyle w:val="ListParagraph"/>
-        <w:numPr>
-          <w:ilvl w:val="0"/>
-          <w:numId w:val="2"/>
-        </w:numPr>
-        <w:spacing w:after="50" w:line="252"/>
-      </w:pPr>
-      <w:r>
-        <w:rPr>
-          <w:rFonts w:ascii="Calibri" w:cs="Calibri" w:eastAsia="Calibri" w:hAnsi="Calibri"/>
-          <w:sz w:val="21"/>
-          <w:szCs w:val="21"/>
-        </w:rPr>
-        <w:t xml:space="preserve">Mostrar os campos preenchidos e as cores de confiança. Corrigir um campo e guardar.</w:t>
+        <w:t xml:space="preserve">2. Painel e alertas  ·  3 min</w:t>
+      </w:r>
+    </w:p>
+    <w:p>
+      <w:pPr>
+        <w:pStyle w:val="ListParagraph"/>
+        <w:keepNext/>
+        <w:numPr>
+          <w:ilvl w:val="0"/>
+          <w:numId w:val="2"/>
+        </w:numPr>
+        <w:spacing w:after="50" w:line="252"/>
+      </w:pPr>
+      <w:r>
+        <w:rPr>
+          <w:rFonts w:ascii="Calibri" w:cs="Calibri" w:eastAsia="Calibri" w:hAnsi="Calibri"/>
+          <w:sz w:val="21"/>
+          <w:szCs w:val="21"/>
+        </w:rPr>
+        <w:t xml:space="preserve">Abrir o Dashboard: um cartão por área, cada uma com os seus números.</w:t>
+      </w:r>
+    </w:p>
+    <w:p>
+      <w:pPr>
+        <w:pStyle w:val="ListParagraph"/>
+        <w:keepNext w:val="false"/>
+        <w:numPr>
+          <w:ilvl w:val="0"/>
+          <w:numId w:val="2"/>
+        </w:numPr>
+        <w:spacing w:after="50" w:line="252"/>
+      </w:pPr>
+      <w:r>
+        <w:rPr>
+          <w:rFonts w:ascii="Calibri" w:cs="Calibri" w:eastAsia="Calibri" w:hAnsi="Calibri"/>
+          <w:sz w:val="21"/>
+          <w:szCs w:val="21"/>
+        </w:rPr>
+        <w:t xml:space="preserve">Abrir Alertas: agendamentos em atraso, gerador e contratos a terminar.</w:t>
+      </w:r>
+    </w:p>
+    <w:p>
+      <w:pPr>
+        <w:pStyle w:val="ListParagraph"/>
+        <w:keepNext w:val="false"/>
+        <w:numPr>
+          <w:ilvl w:val="0"/>
+          <w:numId w:val="2"/>
+        </w:numPr>
+        <w:spacing w:after="50" w:line="252"/>
+      </w:pPr>
+      <w:r>
+        <w:rPr>
+          <w:rFonts w:ascii="Calibri" w:cs="Calibri" w:eastAsia="Calibri" w:hAnsi="Calibri"/>
+          <w:sz w:val="21"/>
+          <w:szCs w:val="21"/>
+        </w:rPr>
+        <w:t xml:space="preserve">Clicar num alerta e mostrar a ficha da instalação com tudo o que lá aconteceu.</w:t>
       </w:r>
     </w:p>
     <w:p>
@@ -501,12 +1182,14 @@
           <w:sz w:val="21"/>
           <w:szCs w:val="21"/>
         </w:rPr>
-        <w:t xml:space="preserve">“A equipa deixa de digitar. Só confirma o que a IA leu.”</w:t>
+        <w:t xml:space="preserve">“Isto é o que o vosso responsável vê de manhã: o que precisa de atenção hoje, sem abrir nenhum Excel.”</w:t>
       </w:r>
     </w:p>
     <w:p>
       <w:pPr>
         <w:pStyle w:val="Heading2"/>
+        <w:keepNext/>
+        <w:keepLines/>
         <w:pBdr>
           <w:bottom w:val="single" w:color="E3C2C5" w:sz="4" w:space="2"/>
         </w:pBdr>
@@ -521,61 +1204,45 @@
           <w:sz w:val="25"/>
           <w:szCs w:val="25"/>
         </w:rPr>
-        <w:t xml:space="preserve">4. Gerador  ·  3 min</w:t>
-      </w:r>
-    </w:p>
-    <w:p>
-      <w:pPr>
-        <w:pStyle w:val="ListParagraph"/>
-        <w:numPr>
-          <w:ilvl w:val="0"/>
-          <w:numId w:val="2"/>
-        </w:numPr>
-        <w:spacing w:after="50" w:line="252"/>
-      </w:pPr>
-      <w:r>
-        <w:rPr>
-          <w:rFonts w:ascii="Calibri" w:cs="Calibri" w:eastAsia="Calibri" w:hAnsi="Calibri"/>
-          <w:sz w:val="21"/>
-          <w:szCs w:val="21"/>
-        </w:rPr>
-        <w:t xml:space="preserve">Em Leituras do gerador, importar capturas dos e-mails (as do cliente, se as trouxe).</w:t>
-      </w:r>
-    </w:p>
-    <w:p>
-      <w:pPr>
-        <w:pStyle w:val="ListParagraph"/>
-        <w:numPr>
-          <w:ilvl w:val="0"/>
-          <w:numId w:val="2"/>
-        </w:numPr>
-        <w:spacing w:after="50" w:line="252"/>
-      </w:pPr>
-      <w:r>
-        <w:rPr>
-          <w:rFonts w:ascii="Calibri" w:cs="Calibri" w:eastAsia="Calibri" w:hAnsi="Calibri"/>
-          <w:sz w:val="21"/>
-          <w:szCs w:val="21"/>
-        </w:rPr>
-        <w:t xml:space="preserve">Mostrar o nível, o consumo habitual por hora e os dias até ficar vazio.</w:t>
-      </w:r>
-    </w:p>
-    <w:p>
-      <w:pPr>
-        <w:pStyle w:val="ListParagraph"/>
-        <w:numPr>
-          <w:ilvl w:val="0"/>
-          <w:numId w:val="2"/>
-        </w:numPr>
-        <w:spacing w:after="50" w:line="252"/>
-      </w:pPr>
-      <w:r>
-        <w:rPr>
-          <w:rFonts w:ascii="Calibri" w:cs="Calibri" w:eastAsia="Calibri" w:hAnsi="Calibri"/>
-          <w:sz w:val="21"/>
-          <w:szCs w:val="21"/>
-        </w:rPr>
-        <w:t xml:space="preserve">Mostrar o alerta “Combustível desceu sem o gerador trabalhar”.</w:t>
+        <w:t xml:space="preserve">3. Ordem de trabalho lida por IA  ·  3 min</w:t>
+      </w:r>
+    </w:p>
+    <w:p>
+      <w:pPr>
+        <w:pStyle w:val="ListParagraph"/>
+        <w:keepNext/>
+        <w:numPr>
+          <w:ilvl w:val="0"/>
+          <w:numId w:val="2"/>
+        </w:numPr>
+        <w:spacing w:after="50" w:line="252"/>
+      </w:pPr>
+      <w:r>
+        <w:rPr>
+          <w:rFonts w:ascii="Calibri" w:cs="Calibri" w:eastAsia="Calibri" w:hAnsi="Calibri"/>
+          <w:sz w:val="21"/>
+          <w:szCs w:val="21"/>
+        </w:rPr>
+        <w:t xml:space="preserve">Em Nova manutenção, fotografar a ordem de trabalho em papel com o telemóvel.</w:t>
+      </w:r>
+    </w:p>
+    <w:p>
+      <w:pPr>
+        <w:pStyle w:val="ListParagraph"/>
+        <w:keepNext w:val="false"/>
+        <w:numPr>
+          <w:ilvl w:val="0"/>
+          <w:numId w:val="2"/>
+        </w:numPr>
+        <w:spacing w:after="50" w:line="252"/>
+      </w:pPr>
+      <w:r>
+        <w:rPr>
+          <w:rFonts w:ascii="Calibri" w:cs="Calibri" w:eastAsia="Calibri" w:hAnsi="Calibri"/>
+          <w:sz w:val="21"/>
+          <w:szCs w:val="21"/>
+        </w:rPr>
+        <w:t xml:space="preserve">Mostrar os campos preenchidos e as cores de confiança. Corrigir um campo e guardar.</w:t>
       </w:r>
     </w:p>
     <w:p>
@@ -602,12 +1269,14 @@
           <w:sz w:val="21"/>
           <w:szCs w:val="21"/>
         </w:rPr>
-        <w:t xml:space="preserve">“Se o nível desce e o contador de horas não mexe, alguém tirou combustível. A plataforma avisa-vos no próprio dia.”</w:t>
+        <w:t xml:space="preserve">“A equipa deixa de digitar. Só confirma o que a IA leu.”</w:t>
       </w:r>
     </w:p>
     <w:p>
       <w:pPr>
         <w:pStyle w:val="Heading2"/>
+        <w:keepNext/>
+        <w:keepLines/>
         <w:pBdr>
           <w:bottom w:val="single" w:color="E3C2C5" w:sz="4" w:space="2"/>
         </w:pBdr>
@@ -622,79 +1291,64 @@
           <w:sz w:val="25"/>
           <w:szCs w:val="25"/>
         </w:rPr>
-        <w:t xml:space="preserve">5. Contratos e orçamento  ·  4 min</w:t>
-      </w:r>
-    </w:p>
-    <w:p>
-      <w:pPr>
-        <w:pStyle w:val="ListParagraph"/>
-        <w:numPr>
-          <w:ilvl w:val="0"/>
-          <w:numId w:val="2"/>
-        </w:numPr>
-        <w:spacing w:after="50" w:line="252"/>
-      </w:pPr>
-      <w:r>
-        <w:rPr>
-          <w:rFonts w:ascii="Calibri" w:cs="Calibri" w:eastAsia="Calibri" w:hAnsi="Calibri"/>
-          <w:sz w:val="21"/>
-          <w:szCs w:val="21"/>
-        </w:rPr>
-        <w:t xml:space="preserve">Em Importar mapa Excel, carregar o mapa do cliente (ou o de demonstração).</w:t>
-      </w:r>
-    </w:p>
-    <w:p>
-      <w:pPr>
-        <w:pStyle w:val="ListParagraph"/>
-        <w:numPr>
-          <w:ilvl w:val="0"/>
-          <w:numId w:val="2"/>
-        </w:numPr>
-        <w:spacing w:after="50" w:line="252"/>
-      </w:pPr>
-      <w:r>
-        <w:rPr>
-          <w:rFonts w:ascii="Calibri" w:cs="Calibri" w:eastAsia="Calibri" w:hAnsi="Calibri"/>
-          <w:sz w:val="21"/>
-          <w:szCs w:val="21"/>
-        </w:rPr>
-        <w:t xml:space="preserve">Mostrar os Pontos a rever: o que falta distribuir, contratos sem data de fim, periodicidades em dúvida.</w:t>
-      </w:r>
-    </w:p>
-    <w:p>
-      <w:pPr>
-        <w:pStyle w:val="ListParagraph"/>
-        <w:numPr>
-          <w:ilvl w:val="0"/>
-          <w:numId w:val="2"/>
-        </w:numPr>
-        <w:spacing w:after="50" w:line="252"/>
-      </w:pPr>
-      <w:r>
-        <w:rPr>
-          <w:rFonts w:ascii="Calibri" w:cs="Calibri" w:eastAsia="Calibri" w:hAnsi="Calibri"/>
-          <w:sz w:val="21"/>
-          <w:szCs w:val="21"/>
-        </w:rPr>
-        <w:t xml:space="preserve">Abrir um contrato, carregar em Distribuir a diferença e guardar.</w:t>
-      </w:r>
-    </w:p>
-    <w:p>
-      <w:pPr>
-        <w:pStyle w:val="ListParagraph"/>
-        <w:numPr>
-          <w:ilvl w:val="0"/>
-          <w:numId w:val="2"/>
-        </w:numPr>
-        <w:spacing w:after="50" w:line="252"/>
-      </w:pPr>
-      <w:r>
-        <w:rPr>
-          <w:rFonts w:ascii="Calibri" w:cs="Calibri" w:eastAsia="Calibri" w:hAnsi="Calibri"/>
-          <w:sz w:val="21"/>
-          <w:szCs w:val="21"/>
-        </w:rPr>
-        <w:t xml:space="preserve">Abrir Orçamento: total anual por centro de custo, linha Por distribuir e botão Excel.</w:t>
+        <w:t xml:space="preserve">4. Gerador  ·  3 min</w:t>
+      </w:r>
+    </w:p>
+    <w:p>
+      <w:pPr>
+        <w:pStyle w:val="ListParagraph"/>
+        <w:keepNext/>
+        <w:numPr>
+          <w:ilvl w:val="0"/>
+          <w:numId w:val="2"/>
+        </w:numPr>
+        <w:spacing w:after="50" w:line="252"/>
+      </w:pPr>
+      <w:r>
+        <w:rPr>
+          <w:rFonts w:ascii="Calibri" w:cs="Calibri" w:eastAsia="Calibri" w:hAnsi="Calibri"/>
+          <w:sz w:val="21"/>
+          <w:szCs w:val="21"/>
+        </w:rPr>
+        <w:t xml:space="preserve">Em Leituras do gerador, importar capturas dos e-mails (as do cliente, se as trouxe).</w:t>
+      </w:r>
+    </w:p>
+    <w:p>
+      <w:pPr>
+        <w:pStyle w:val="ListParagraph"/>
+        <w:keepNext w:val="false"/>
+        <w:numPr>
+          <w:ilvl w:val="0"/>
+          <w:numId w:val="2"/>
+        </w:numPr>
+        <w:spacing w:after="50" w:line="252"/>
+      </w:pPr>
+      <w:r>
+        <w:rPr>
+          <w:rFonts w:ascii="Calibri" w:cs="Calibri" w:eastAsia="Calibri" w:hAnsi="Calibri"/>
+          <w:sz w:val="21"/>
+          <w:szCs w:val="21"/>
+        </w:rPr>
+        <w:t xml:space="preserve">Mostrar o nível, o consumo habitual por hora e os dias até ficar vazio.</w:t>
+      </w:r>
+    </w:p>
+    <w:p>
+      <w:pPr>
+        <w:pStyle w:val="ListParagraph"/>
+        <w:keepNext w:val="false"/>
+        <w:numPr>
+          <w:ilvl w:val="0"/>
+          <w:numId w:val="2"/>
+        </w:numPr>
+        <w:spacing w:after="50" w:line="252"/>
+      </w:pPr>
+      <w:r>
+        <w:rPr>
+          <w:rFonts w:ascii="Calibri" w:cs="Calibri" w:eastAsia="Calibri" w:hAnsi="Calibri"/>
+          <w:sz w:val="21"/>
+          <w:szCs w:val="21"/>
+        </w:rPr>
+        <w:t xml:space="preserve">Mostrar o alerta “Combustível desceu sem o gerador trabalhar”.</w:t>
       </w:r>
     </w:p>
     <w:p>
@@ -721,12 +1375,14 @@
           <w:sz w:val="21"/>
           <w:szCs w:val="21"/>
         </w:rPr>
-        <w:t xml:space="preserve">“Nos mapas Excel é fácil uma fórmula deixar um contrato inteiro fora do orçamento. Aqui o total bate sempre com os contratos.”</w:t>
+        <w:t xml:space="preserve">“Se o nível desce e o contador de horas não mexe, alguém tirou combustível. A plataforma avisa-vos no próprio dia.”</w:t>
       </w:r>
     </w:p>
     <w:p>
       <w:pPr>
         <w:pStyle w:val="Heading2"/>
+        <w:keepNext/>
+        <w:keepLines/>
         <w:pBdr>
           <w:bottom w:val="single" w:color="E3C2C5" w:sz="4" w:space="2"/>
         </w:pBdr>
@@ -741,61 +1397,83 @@
           <w:sz w:val="25"/>
           <w:szCs w:val="25"/>
         </w:rPr>
-        <w:t xml:space="preserve">6. Relatórios  ·  2 min</w:t>
-      </w:r>
-    </w:p>
-    <w:p>
-      <w:pPr>
-        <w:pStyle w:val="ListParagraph"/>
-        <w:numPr>
-          <w:ilvl w:val="0"/>
-          <w:numId w:val="2"/>
-        </w:numPr>
-        <w:spacing w:after="50" w:line="252"/>
-      </w:pPr>
-      <w:r>
-        <w:rPr>
-          <w:rFonts w:ascii="Calibri" w:cs="Calibri" w:eastAsia="Calibri" w:hAnsi="Calibri"/>
-          <w:sz w:val="21"/>
-          <w:szCs w:val="21"/>
-        </w:rPr>
-        <w:t xml:space="preserve">Fornecedores: preço face à média e percentagem de avarias repetidas.</w:t>
-      </w:r>
-    </w:p>
-    <w:p>
-      <w:pPr>
-        <w:pStyle w:val="ListParagraph"/>
-        <w:numPr>
-          <w:ilvl w:val="0"/>
-          <w:numId w:val="2"/>
-        </w:numPr>
-        <w:spacing w:after="50" w:line="252"/>
-      </w:pPr>
-      <w:r>
-        <w:rPr>
-          <w:rFonts w:ascii="Calibri" w:cs="Calibri" w:eastAsia="Calibri" w:hAnsi="Calibri"/>
-          <w:sz w:val="21"/>
-          <w:szCs w:val="21"/>
-        </w:rPr>
-        <w:t xml:space="preserve">Equipamentos: o que custa mais e o que já devia ser substituído.</w:t>
-      </w:r>
-    </w:p>
-    <w:p>
-      <w:pPr>
-        <w:pStyle w:val="ListParagraph"/>
-        <w:numPr>
-          <w:ilvl w:val="0"/>
-          <w:numId w:val="2"/>
-        </w:numPr>
-        <w:spacing w:after="50" w:line="252"/>
-      </w:pPr>
-      <w:r>
-        <w:rPr>
-          <w:rFonts w:ascii="Calibri" w:cs="Calibri" w:eastAsia="Calibri" w:hAnsi="Calibri"/>
-          <w:sz w:val="21"/>
-          <w:szCs w:val="21"/>
-        </w:rPr>
-        <w:t xml:space="preserve">Comparação entre instalações.</w:t>
+        <w:t xml:space="preserve">5. Contratos e orçamento  ·  4 min</w:t>
+      </w:r>
+    </w:p>
+    <w:p>
+      <w:pPr>
+        <w:pStyle w:val="ListParagraph"/>
+        <w:keepNext/>
+        <w:numPr>
+          <w:ilvl w:val="0"/>
+          <w:numId w:val="2"/>
+        </w:numPr>
+        <w:spacing w:after="50" w:line="252"/>
+      </w:pPr>
+      <w:r>
+        <w:rPr>
+          <w:rFonts w:ascii="Calibri" w:cs="Calibri" w:eastAsia="Calibri" w:hAnsi="Calibri"/>
+          <w:sz w:val="21"/>
+          <w:szCs w:val="21"/>
+        </w:rPr>
+        <w:t xml:space="preserve">Em Importar mapa Excel, carregar o mapa do cliente (ou o de demonstração).</w:t>
+      </w:r>
+    </w:p>
+    <w:p>
+      <w:pPr>
+        <w:pStyle w:val="ListParagraph"/>
+        <w:keepNext w:val="false"/>
+        <w:numPr>
+          <w:ilvl w:val="0"/>
+          <w:numId w:val="2"/>
+        </w:numPr>
+        <w:spacing w:after="50" w:line="252"/>
+      </w:pPr>
+      <w:r>
+        <w:rPr>
+          <w:rFonts w:ascii="Calibri" w:cs="Calibri" w:eastAsia="Calibri" w:hAnsi="Calibri"/>
+          <w:sz w:val="21"/>
+          <w:szCs w:val="21"/>
+        </w:rPr>
+        <w:t xml:space="preserve">Mostrar os Pontos a rever: o que falta distribuir, contratos sem data de fim, periodicidades em dúvida.</w:t>
+      </w:r>
+    </w:p>
+    <w:p>
+      <w:pPr>
+        <w:pStyle w:val="ListParagraph"/>
+        <w:keepNext w:val="false"/>
+        <w:numPr>
+          <w:ilvl w:val="0"/>
+          <w:numId w:val="2"/>
+        </w:numPr>
+        <w:spacing w:after="50" w:line="252"/>
+      </w:pPr>
+      <w:r>
+        <w:rPr>
+          <w:rFonts w:ascii="Calibri" w:cs="Calibri" w:eastAsia="Calibri" w:hAnsi="Calibri"/>
+          <w:sz w:val="21"/>
+          <w:szCs w:val="21"/>
+        </w:rPr>
+        <w:t xml:space="preserve">Abrir um contrato, carregar em Distribuir a diferença e guardar.</w:t>
+      </w:r>
+    </w:p>
+    <w:p>
+      <w:pPr>
+        <w:pStyle w:val="ListParagraph"/>
+        <w:keepNext w:val="false"/>
+        <w:numPr>
+          <w:ilvl w:val="0"/>
+          <w:numId w:val="2"/>
+        </w:numPr>
+        <w:spacing w:after="50" w:line="252"/>
+      </w:pPr>
+      <w:r>
+        <w:rPr>
+          <w:rFonts w:ascii="Calibri" w:cs="Calibri" w:eastAsia="Calibri" w:hAnsi="Calibri"/>
+          <w:sz w:val="21"/>
+          <w:szCs w:val="21"/>
+        </w:rPr>
+        <w:t xml:space="preserve">Abrir Orçamento: total anual por centro de custo, linha Por distribuir e botão Excel.</w:t>
       </w:r>
     </w:p>
     <w:p>
@@ -822,12 +1500,14 @@
           <w:sz w:val="21"/>
           <w:szCs w:val="21"/>
         </w:rPr>
-        <w:t xml:space="preserve">“Na próxima renegociação com um fornecedor, levam estes números.”</w:t>
+        <w:t xml:space="preserve">“Nos mapas Excel é fácil uma fórmula deixar um contrato inteiro fora do orçamento. Aqui o total bate sempre com os contratos.”</w:t>
       </w:r>
     </w:p>
     <w:p>
       <w:pPr>
         <w:pStyle w:val="Heading2"/>
+        <w:keepNext/>
+        <w:keepLines/>
         <w:pBdr>
           <w:bottom w:val="single" w:color="E3C2C5" w:sz="4" w:space="2"/>
         </w:pBdr>
@@ -842,61 +1522,64 @@
           <w:sz w:val="25"/>
           <w:szCs w:val="25"/>
         </w:rPr>
-        <w:t xml:space="preserve">7. Fecho  ·  2 min</w:t>
-      </w:r>
-    </w:p>
-    <w:p>
-      <w:pPr>
-        <w:pStyle w:val="ListParagraph"/>
-        <w:numPr>
-          <w:ilvl w:val="0"/>
-          <w:numId w:val="2"/>
-        </w:numPr>
-        <w:spacing w:after="50" w:line="252"/>
-      </w:pPr>
-      <w:r>
-        <w:rPr>
-          <w:rFonts w:ascii="Calibri" w:cs="Calibri" w:eastAsia="Calibri" w:hAnsi="Calibri"/>
-          <w:sz w:val="21"/>
-          <w:szCs w:val="21"/>
-        </w:rPr>
-        <w:t xml:space="preserve">Resumir em três frases o que viram e o que resolve para eles.</w:t>
-      </w:r>
-    </w:p>
-    <w:p>
-      <w:pPr>
-        <w:pStyle w:val="ListParagraph"/>
-        <w:numPr>
-          <w:ilvl w:val="0"/>
-          <w:numId w:val="2"/>
-        </w:numPr>
-        <w:spacing w:after="50" w:line="252"/>
-      </w:pPr>
-      <w:r>
-        <w:rPr>
-          <w:rFonts w:ascii="Calibri" w:cs="Calibri" w:eastAsia="Calibri" w:hAnsi="Calibri"/>
-          <w:sz w:val="21"/>
-          <w:szCs w:val="21"/>
-        </w:rPr>
-        <w:t xml:space="preserve">Propor o piloto: 60 dias, 5 a 10 instalações, nós importamos os dados e formamos a equipa.</w:t>
-      </w:r>
-    </w:p>
-    <w:p>
-      <w:pPr>
-        <w:pStyle w:val="ListParagraph"/>
-        <w:numPr>
-          <w:ilvl w:val="0"/>
-          <w:numId w:val="2"/>
-        </w:numPr>
-        <w:spacing w:after="50" w:line="252"/>
-      </w:pPr>
-      <w:r>
-        <w:rPr>
-          <w:rFonts w:ascii="Calibri" w:cs="Calibri" w:eastAsia="Calibri" w:hAnsi="Calibri"/>
-          <w:sz w:val="21"/>
-          <w:szCs w:val="21"/>
-        </w:rPr>
-        <w:t xml:space="preserve">Combinar já a data de início e quem é o ponto focal.</w:t>
+        <w:t xml:space="preserve">6. Relatórios  ·  2 min</w:t>
+      </w:r>
+    </w:p>
+    <w:p>
+      <w:pPr>
+        <w:pStyle w:val="ListParagraph"/>
+        <w:keepNext/>
+        <w:numPr>
+          <w:ilvl w:val="0"/>
+          <w:numId w:val="2"/>
+        </w:numPr>
+        <w:spacing w:after="50" w:line="252"/>
+      </w:pPr>
+      <w:r>
+        <w:rPr>
+          <w:rFonts w:ascii="Calibri" w:cs="Calibri" w:eastAsia="Calibri" w:hAnsi="Calibri"/>
+          <w:sz w:val="21"/>
+          <w:szCs w:val="21"/>
+        </w:rPr>
+        <w:t xml:space="preserve">Fornecedores: preço face à média e percentagem de avarias repetidas.</w:t>
+      </w:r>
+    </w:p>
+    <w:p>
+      <w:pPr>
+        <w:pStyle w:val="ListParagraph"/>
+        <w:keepNext w:val="false"/>
+        <w:numPr>
+          <w:ilvl w:val="0"/>
+          <w:numId w:val="2"/>
+        </w:numPr>
+        <w:spacing w:after="50" w:line="252"/>
+      </w:pPr>
+      <w:r>
+        <w:rPr>
+          <w:rFonts w:ascii="Calibri" w:cs="Calibri" w:eastAsia="Calibri" w:hAnsi="Calibri"/>
+          <w:sz w:val="21"/>
+          <w:szCs w:val="21"/>
+        </w:rPr>
+        <w:t xml:space="preserve">Equipamentos: o que custa mais e o que já devia ser substituído.</w:t>
+      </w:r>
+    </w:p>
+    <w:p>
+      <w:pPr>
+        <w:pStyle w:val="ListParagraph"/>
+        <w:keepNext w:val="false"/>
+        <w:numPr>
+          <w:ilvl w:val="0"/>
+          <w:numId w:val="2"/>
+        </w:numPr>
+        <w:spacing w:after="50" w:line="252"/>
+      </w:pPr>
+      <w:r>
+        <w:rPr>
+          <w:rFonts w:ascii="Calibri" w:cs="Calibri" w:eastAsia="Calibri" w:hAnsi="Calibri"/>
+          <w:sz w:val="21"/>
+          <w:szCs w:val="21"/>
+        </w:rPr>
+        <w:t xml:space="preserve">Comparação entre instalações.</w:t>
       </w:r>
     </w:p>
     <w:p>
@@ -923,12 +1606,120 @@
           <w:sz w:val="21"/>
           <w:szCs w:val="21"/>
         </w:rPr>
-        <w:t xml:space="preserve">“Querem começar o piloto na próxima semana com as agências de uma província?”</w:t>
+        <w:t xml:space="preserve">“Na próxima renegociação com um fornecedor, levam estes números.”</w:t>
       </w:r>
     </w:p>
     <w:p>
       <w:pPr>
         <w:pStyle w:val="Heading2"/>
+        <w:keepNext/>
+        <w:keepLines/>
+        <w:pBdr>
+          <w:bottom w:val="single" w:color="E3C2C5" w:sz="4" w:space="2"/>
+        </w:pBdr>
+        <w:spacing w:after="90" w:before="220"/>
+      </w:pPr>
+      <w:r>
+        <w:rPr>
+          <w:rFonts w:ascii="Calibri" w:cs="Calibri" w:eastAsia="Calibri" w:hAnsi="Calibri"/>
+          <w:b/>
+          <w:bCs/>
+          <w:color w:val="A0101E"/>
+          <w:sz w:val="25"/>
+          <w:szCs w:val="25"/>
+        </w:rPr>
+        <w:t xml:space="preserve">7. Fecho  ·  2 min</w:t>
+      </w:r>
+    </w:p>
+    <w:p>
+      <w:pPr>
+        <w:pStyle w:val="ListParagraph"/>
+        <w:keepNext/>
+        <w:numPr>
+          <w:ilvl w:val="0"/>
+          <w:numId w:val="2"/>
+        </w:numPr>
+        <w:spacing w:after="50" w:line="252"/>
+      </w:pPr>
+      <w:r>
+        <w:rPr>
+          <w:rFonts w:ascii="Calibri" w:cs="Calibri" w:eastAsia="Calibri" w:hAnsi="Calibri"/>
+          <w:sz w:val="21"/>
+          <w:szCs w:val="21"/>
+        </w:rPr>
+        <w:t xml:space="preserve">Resumir em três frases o que viram e o que resolve para eles.</w:t>
+      </w:r>
+    </w:p>
+    <w:p>
+      <w:pPr>
+        <w:pStyle w:val="ListParagraph"/>
+        <w:keepNext w:val="false"/>
+        <w:numPr>
+          <w:ilvl w:val="0"/>
+          <w:numId w:val="2"/>
+        </w:numPr>
+        <w:spacing w:after="50" w:line="252"/>
+      </w:pPr>
+      <w:r>
+        <w:rPr>
+          <w:rFonts w:ascii="Calibri" w:cs="Calibri" w:eastAsia="Calibri" w:hAnsi="Calibri"/>
+          <w:sz w:val="21"/>
+          <w:szCs w:val="21"/>
+        </w:rPr>
+        <w:t xml:space="preserve">Propor o piloto: 60 dias, 5 a 10 instalações, nós importamos os dados e formamos a equipa.</w:t>
+      </w:r>
+    </w:p>
+    <w:p>
+      <w:pPr>
+        <w:pStyle w:val="ListParagraph"/>
+        <w:keepNext w:val="false"/>
+        <w:numPr>
+          <w:ilvl w:val="0"/>
+          <w:numId w:val="2"/>
+        </w:numPr>
+        <w:spacing w:after="50" w:line="252"/>
+      </w:pPr>
+      <w:r>
+        <w:rPr>
+          <w:rFonts w:ascii="Calibri" w:cs="Calibri" w:eastAsia="Calibri" w:hAnsi="Calibri"/>
+          <w:sz w:val="21"/>
+          <w:szCs w:val="21"/>
+        </w:rPr>
+        <w:t xml:space="preserve">Combinar já a data de início e quem é o ponto focal.</w:t>
+      </w:r>
+    </w:p>
+    <w:p>
+      <w:pPr>
+        <w:spacing w:after="90" w:line="264"/>
+        <w:ind w:left="280"/>
+      </w:pPr>
+      <w:r>
+        <w:rPr>
+          <w:rFonts w:ascii="Calibri" w:cs="Calibri" w:eastAsia="Calibri" w:hAnsi="Calibri"/>
+          <w:b/>
+          <w:bCs/>
+          <w:color w:val="A0101E"/>
+          <w:sz w:val="21"/>
+          <w:szCs w:val="21"/>
+        </w:rPr>
+        <w:t xml:space="preserve">Dizer: </w:t>
+      </w:r>
+      <w:r>
+        <w:rPr>
+          <w:rFonts w:ascii="Calibri" w:cs="Calibri" w:eastAsia="Calibri" w:hAnsi="Calibri"/>
+          <w:i/>
+          <w:iCs/>
+          <w:sz w:val="21"/>
+          <w:szCs w:val="21"/>
+        </w:rPr>
+        <w:t xml:space="preserve">“Querem começar o piloto na próxima semana com as instalações de uma cidade?”</w:t>
+      </w:r>
+    </w:p>
+    <w:p>
+      <w:pPr>
+        <w:pStyle w:val="Heading2"/>
+        <w:keepNext/>
+        <w:keepLines/>
         <w:pBdr>
           <w:bottom w:val="single" w:color="E3C2C5" w:sz="4" w:space="2"/>
         </w:pBdr>
@@ -1364,6 +2155,8 @@
     <w:p>
       <w:pPr>
         <w:pStyle w:val="Heading2"/>
+        <w:keepNext/>
+        <w:keepLines/>
         <w:pBdr>
           <w:bottom w:val="single" w:color="E3C2C5" w:sz="4" w:space="2"/>
         </w:pBdr>
@@ -1384,6 +2177,7 @@
     <w:p>
       <w:pPr>
         <w:pStyle w:val="ListParagraph"/>
+        <w:keepNext w:val="false"/>
         <w:numPr>
           <w:ilvl w:val="0"/>
           <w:numId w:val="2"/>
@@ -1402,6 +2196,7 @@
     <w:p>
       <w:pPr>
         <w:pStyle w:val="ListParagraph"/>
+        <w:keepNext w:val="false"/>
         <w:numPr>
           <w:ilvl w:val="0"/>
           <w:numId w:val="2"/>
@@ -1420,6 +2215,7 @@
     <w:p>
       <w:pPr>
         <w:pStyle w:val="ListParagraph"/>
+        <w:keepNext w:val="false"/>
         <w:numPr>
           <w:ilvl w:val="0"/>
           <w:numId w:val="2"/>

</xml_diff>